<commit_message>
fix(sync): skip redundant initial route refresh
</commit_message>
<xml_diff>
--- a/jackyun-portal/docs/sync-page-subscription-3.47.6-implementation-and-acceptance.docx
+++ b/jackyun-portal/docs/sync-page-subscription-3.47.6-implementation-and-acceptance.docx
@@ -222,6 +222,47 @@
     <w:p>
       <w:r>
         <w:t>先在干净 runner 上跑全量同步测试、类型检查、构建和浏览器验收；随后建立隔离数据库副本并演练迁移和恢复；再为测试账号按账号及资源显式启用 v5，完成认证读写、回执/哈希复读、断网恢复、多设备并发冲突和回滚。只有这些证据齐备，才能评估是否扩大灰度。</w:t>
+      </w:r>
+    </w:p>
+    <w:p>
+      <w:pPr>
+        <w:pStyle w:val="Heading1"/>
+      </w:pPr>
+      <w:r>
+        <w:t>CI追加验收与启动期同步修正</w:t>
+      </w:r>
+    </w:p>
+    <w:p>
+      <w:r>
+        <w:t>提交 8132b15 的 GitHub Actions 已通过生产构建、TypeScript、ESLint、密钥检查和 912 项数据安全回归。Playwright 生产 UI 流程未通过：ui-shell 的主题切换断言失败，另有 quiz、IELTS dashboard、active legacy、study guide、music player、answer sheet、CUE route/search 与 review queue 失败。对照 PR #158 的 run 40264020743，后九类失败与既有基线一致；ui-shell 在对照运行中通过，因此这次额外失败按潜在回归处理，不能按既有失败豁免。</w:t>
+      </w:r>
+    </w:p>
+    <w:p>
+      <w:r>
+        <w:t>审查发现首次挂载时 usePathname effect 会额外发出页面变化事件，而现有初始化同步已经按当前 URL 选择资源。现已用 pathname ref 记住初始路径，仅在后续真实 pathname 变化时通知同步器，避免启动期重复同步；连续导航期间仍只保留最新目标页面。此调整不改变 3.47.6 的协议、数据格式或 v5 默认关闭策略。</w:t>
+      </w:r>
+    </w:p>
+    <w:p>
+      <w:r>
+        <w:t>新增 workspace-sync-recovery 用例验证初始 pathname 不重复触发资源拉取。该文件现为 12/12 通过；原有页面切换、30 秒冷却绕过和同步中多次导航合并用例仍全部通过。提交修正后必须重新运行 GitHub Actions，并确认 ui-shell 回到通过状态；此前失败的其余浏览器用例仍须持续记录，不能将全套 UI 验收描述为通过。</w:t>
+      </w:r>
+    </w:p>
+    <w:p>
+      <w:pPr>
+        <w:pStyle w:val="Heading1"/>
+      </w:pPr>
+      <w:r>
+        <w:t>最新 CI 与发布判定</w:t>
+      </w:r>
+    </w:p>
+    <w:p>
+      <w:r>
+        <w:t>PR #161 提交 8132b15 的 Vercel 预览部署为 READY，精确对应该提交。CI 的构建、类型/静态检查和数据安全测试通过，但浏览器验收总体失败，因此该提交未满足合并门槛。预览 READY 不是生产发布，也不代表 Azure 数据库读写已验证。</w:t>
+      </w:r>
+    </w:p>
+    <w:p>
+      <w:r>
+        <w:t>Azure Functions 3.9.0 已部署且 v5 manifest 未认证请求抵达认证层（返回 401）；v5 仍关闭。生产数据库迁移/恢复演练、受控账号真实读写与回执哈希、手机电脑双向同步及回滚仍是未完成的独立上线门槛。</w:t>
       </w:r>
     </w:p>
     <w:sectPr>

</xml_diff>

<commit_message>
test(sync): update pathname hook mock
</commit_message>
<xml_diff>
--- a/jackyun-portal/docs/sync-page-subscription-3.47.6-implementation-and-acceptance.docx
+++ b/jackyun-portal/docs/sync-page-subscription-3.47.6-implementation-and-acceptance.docx
@@ -263,6 +263,19 @@
     <w:p>
       <w:r>
         <w:t>Azure Functions 3.9.0 已部署且 v5 manifest 未认证请求抵达认证层（返回 401）；v5 仍关闭。生产数据库迁移/恢复演练、受控账号真实读写与回执哈希、手机电脑双向同步及回滚仍是未完成的独立上线门槛。</w:t>
+      </w:r>
+    </w:p>
+    <w:p>
+      <w:pPr>
+        <w:pStyle w:val="Heading1"/>
+      </w:pPr>
+      <w:r>
+        <w:t>新增 hook 测试夹具适配</w:t>
+      </w:r>
+    </w:p>
+    <w:p>
+      <w:r>
+        <w:t>修正初始 pathname 行为后，GitHub Actions run 40270481338 的构建及 TypeScript/ESLint/密钥检查通过；数据安全回归最初因 tests/local-backup-performance.test.mts 的 React mock 未提供 useRef 而失败。该 mock 已补齐 useRef；这属于测试夹具适配，不改变备份或同步运行逻辑。提交该适配后仍须以新 CI 结果作为最终验收，目前浏览器 UI 步骤因数据安全步骤提前失败而尚未执行。</w:t>
       </w:r>
     </w:p>
     <w:sectPr>

</xml_diff>

<commit_message>
refactor(sync): isolate page route subscription
</commit_message>
<xml_diff>
--- a/jackyun-portal/docs/sync-page-subscription-3.47.6-implementation-and-acceptance.docx
+++ b/jackyun-portal/docs/sync-page-subscription-3.47.6-implementation-and-acceptance.docx
@@ -276,6 +276,19 @@
     <w:p>
       <w:r>
         <w:t>修正初始 pathname 行为后，GitHub Actions run 40270481338 的构建及 TypeScript/ESLint/密钥检查通过；数据安全回归最初因 tests/local-backup-performance.test.mts 的 React mock 未提供 useRef 而失败。该 mock 已补齐 useRef；这属于测试夹具适配，不改变备份或同步运行逻辑。提交该适配后仍须以新 CI 结果作为最终验收，目前浏览器 UI 步骤因数据安全步骤提前失败而尚未执行。</w:t>
+      </w:r>
+    </w:p>
+    <w:p>
+      <w:pPr>
+        <w:pStyle w:val="Heading1"/>
+      </w:pPr>
+      <w:r>
+        <w:t>路由订阅影响面隔离</w:t>
+      </w:r>
+    </w:p>
+    <w:p>
+      <w:r>
+        <w:t>run 40271076435 的数据安全测试已通过，但 ui-shell 再次失败；与 PR #160 基线 run 40267376899 对照，其余失败的浏览器套件均属于此前已记录项。为避免 pathname 变化使整个 LocalWorkspaceSync 协调器重渲染，路由监听已抽离为独立 WorkspaceRouteSyncTrigger 子组件。初始路径不触发额外同步，后续真实导航才发事件。修改后 workspace-sync-recovery 与 local-backup-performance 两个测试文件共 17 项通过。该结构调整的效果仍需下一轮干净 CI 浏览器测试确认，不预先宣称已修复 ui-shell。</w:t>
       </w:r>
     </w:p>
     <w:sectPr>

</xml_diff>

<commit_message>
fix(sync): limit route trigger to signed-in users
</commit_message>
<xml_diff>
--- a/jackyun-portal/docs/sync-page-subscription-3.47.6-implementation-and-acceptance.docx
+++ b/jackyun-portal/docs/sync-page-subscription-3.47.6-implementation-and-acceptance.docx
@@ -289,6 +289,11 @@
     <w:p>
       <w:r>
         <w:t>run 40271076435 的数据安全测试已通过，但 ui-shell 再次失败；与 PR #160 基线 run 40267376899 对照，其余失败的浏览器套件均属于此前已记录项。为避免 pathname 变化使整个 LocalWorkspaceSync 协调器重渲染，路由监听已抽离为独立 WorkspaceRouteSyncTrigger 子组件。初始路径不触发额外同步，后续真实导航才发事件。修改后 workspace-sync-recovery 与 local-backup-performance 两个测试文件共 17 项通过。该结构调整的效果仍需下一轮干净 CI 浏览器测试确认，不预先宣称已修复 ui-shell。</w:t>
+      </w:r>
+    </w:p>
+    <w:p>
+      <w:r>
+        <w:t>进一步将 WorkspaceRouteSyncTrigger 限定为已登录用户才挂载；访客没有云端资源订阅需求，不需要新增 usePathname 订阅。账号初始化仍以当前 URL 建立首次资源范围，后续 pathname 变化才触发同步。隔离与登录条件修改后的专项测试仍为 17/17 通过；待 CI 再次确认浏览器 UI 行为。</w:t>
       </w:r>
     </w:p>
     <w:sectPr>

</xml_diff>

<commit_message>
docs(sync): record page subscription acceptance
</commit_message>
<xml_diff>
--- a/jackyun-portal/docs/sync-page-subscription-3.47.6-implementation-and-acceptance.docx
+++ b/jackyun-portal/docs/sync-page-subscription-3.47.6-implementation-and-acceptance.docx
@@ -294,6 +294,29 @@
     <w:p>
       <w:r>
         <w:t>进一步将 WorkspaceRouteSyncTrigger 限定为已登录用户才挂载；访客没有云端资源订阅需求，不需要新增 usePathname 订阅。账号初始化仍以当前 URL 建立首次资源范围，后续 pathname 变化才触发同步。隔离与登录条件修改后的专项测试仍为 17/17 通过；待 CI 再次确认浏览器 UI 行为。</w:t>
+      </w:r>
+    </w:p>
+    <w:p>
+      <w:pPr>
+        <w:pStyle w:val="Heading1"/>
+      </w:pPr>
+      <w:r>
+        <w:t>最终验收结果</w:t>
+      </w:r>
+    </w:p>
+    <w:p>
+      <w:r>
+        <w:t>提交 3176363（run 40274215714）中，Next.js 生产构建、TypeScript、ESLint、密钥扫描和 913/913 Node 数据安全回归通过。页面切换立即订阅、首次 pathname 不重复拉取、同步中多次导航折叠至最新页面三项专项测试均通过；浏览器 ui-shell、ui-shell-auth、navigation-feedback、sync-status-indicator 与资源性能流程也通过。</w:t>
+      </w:r>
+    </w:p>
+    <w:p>
+      <w:r>
+        <w:t>完整 UI modernization workflow 仍因 quiz-ui、IELTS dashboard、active-legacy-ui、study-guide-state、music-player-state、answer-sheet-legacy、cue-route-draft、cue-search 和 review-queue 9 项失败而标记红色。上述失败与 PR #160 基线 run 40267376899 的失败项一致；本次不得宣称全套浏览器 UI 通过。run 81 曾短暂出现 ui-shell 主题断言失败，隔离并限制 route trigger 后，run 82 的 ui-shell 已通过。</w:t>
+      </w:r>
+    </w:p>
+    <w:p>
+      <w:r>
+        <w:t>Vercel 预览部署 READY 并对应提交 3176363。此为预览验收，不是生产发布；Azure 3.9.0 的真实数据库迁移、受控生产账号读写及手机/电脑跨设备验收仍未完成，v5 继续默认关闭。</w:t>
       </w:r>
     </w:p>
     <w:sectPr>

</xml_diff>